<commit_message>
v60 final: cite papers from the three target journals
Adds seven citations to existing sentences, without changing them, from
the journals the professor chose for submission: Journal of Innovation &
Knowledge (Zhang and Zhang 2025; Zhao et al. 2023), Technology Analysis
& Strategic Management (Whang 2018; Yun and Geum 2019; Lee et al. 2017,
besides the already cited Kwon et al. 2020) and IEEE Access (Choi et
al. 2022; Lei et al. 2019). References now 55. Notes updated.

Co-Authored-By: Claude Opus 5.5 <noreply@anthropic.com>
Claude-Session: https://claude.ai/code/session_01SvckvZxt3hAXTDPnm8YPEC
</commit_message>
<xml_diff>
--- a/journal/manuscript_v60_ko.docx
+++ b/journal/manuscript_v60_ko.docx
@@ -286,7 +286,7 @@
         <w:pStyle w:val="FirstParagraph"/>
       </w:pPr>
       <w:r>
-        <w:t xml:space="preserve">특정 영역에서 개발된 기술이 그 경계를 넘어 다른 영역으로 확산된다는 논의는 오랜 연원을 가진다. Rosenberg(1963)는 19세기 공작기계 산업의 출현을 분석하면서, 총기나 재봉틀을 위해 개발된 가공 기술이 다른 제품에도 활용될 수 있음을 기업들이 인식해 가는 과정을 기술적 수렴이라 명명하였다. 이후 Kodama(1992)는 분리되어 있던 기술 분야들을 결합하여 어느 한 분야도 단독으로는 갖지 못한 역량을 창출하는 과정을 기술융합으로 개념화하였다. Hacklin et al.(2010)은 융합이 지식의 융합에서 기술과 응용의 융합을 거쳐 산업의 융합으로 단계적으로 진행된다는 단계 모형을 제시하였으며, 이 단계들이 상호 피드백을 통해 공진화적 순환을 이룬다고 보았다(Hacklin et al., 2009). 또한 Curran과 Leker(2011)는 이러한 단계를 특허 지표로 관찰하는 방법을 제안하였다. 이러한 논의를 거쳐 기술융합 연구는 기술혁신경영 분야의 독립된 연구 흐름으로 자리 잡았으며(Geum et al., 2016; Sick and Bröring, 2022), 융합의 동인에 관한 실증 연구도 축적되기 시작하였다. 이 가운데 Caviggioli(2016)는 융합이 발생하기 쉬운 기술 분야의 특성을, Hwang(2020)은 한국 정보통신기업의 자료를 활용하여 협력 유형과 융합의 관계를 분석하였다.</w:t>
+        <w:t xml:space="preserve">특정 영역에서 개발된 기술이 그 경계를 넘어 다른 영역으로 확산된다는 논의는 오랜 연원을 가진다. Rosenberg(1963)는 19세기 공작기계 산업의 출현을 분석하면서, 총기나 재봉틀을 위해 개발된 가공 기술이 다른 제품에도 활용될 수 있음을 기업들이 인식해 가는 과정을 기술적 수렴이라 명명하였다. 이후 Kodama(1992)는 분리되어 있던 기술 분야들을 결합하여 어느 한 분야도 단독으로는 갖지 못한 역량을 창출하는 과정을 기술융합으로 개념화하였다. Hacklin et al.(2010)은 융합이 지식의 융합에서 기술과 응용의 융합을 거쳐 산업의 융합으로 단계적으로 진행된다는 단계 모형을 제시하였으며, 이 단계들이 상호 피드백을 통해 공진화적 순환을 이룬다고 보았다(Hacklin et al., 2009). 또한 Curran과 Leker(2011)는 이러한 단계를 특허 지표로 관찰하는 방법을 제안하였다. 이러한 논의를 거쳐 기술융합 연구는 기술혁신경영 분야의 독립된 연구 흐름으로 자리 잡았으며(Geum et al., 2016; Sick and Bröring, 2022), 융합의 동인에 관한 실증 연구도 축적되기 시작하였다(Whang, 2018). 이 가운데 Caviggioli(2016)는 융합이 발생하기 쉬운 기술 분야의 특성을, Hwang(2020)은 한국 정보통신기업의 자료를 활용하여 협력 유형과 융합의 관계를 분석하였다.</w:t>
       </w:r>
     </w:p>
     <w:p>
@@ -294,7 +294,7 @@
         <w:pStyle w:val="BodyText"/>
       </w:pPr>
       <w:r>
-        <w:t xml:space="preserve">이러한 선행연구는 세 가지 특징을 공유하며, 이는 본 연구의 출발점이 된다. 첫째, 연구의 초점이 서로 다른 산업이나 기술 분야 간의 중첩에 있다. 통신과 컴퓨팅, 식품과 제약, 나노기술과 바이오기술 등 대표적인 사례는 모두 서로 다른 산업의 기업들이 지식 기반의 중첩을 발견하는 경우에 해당한다(Gambardella and Torrisi, 1998; Bröring et al., 2006; No and Park, 2010). 둘째, 융합은 일반적으로 두 분야 사이의 공동분류나 인용을 집계한 분야 수준의 지표로 측정된다(Curran et al., 2010; Cho and Kim, 2014; Song et al., 2017). 이러한 지표는 두 분야가 융합하는지, 그리고 언제 융합하는지를 보여 주지만, 어떠한 발명이 융합을 포함하며 어떠한 특성을 지닌 발명이 그러한지는 설명하지 못한다. 개별 특허 간의 차이가 평균 속에 가려지기 때문이다. 셋째, 융합을 지식에서 기술과 응용을 거쳐 산업으로 나아가는 단계적 과정으로 보는 이론에 비해(Hacklin et al., 2010), 실증 연구는 대체로 융합의 정도가 증가하였는지를 추세로 확인하는 데 그쳤다. 즉, 융합이 진행되면서 어떠한 기술이 결합하며 융합의 내용과 중심이 어떻게 변화하는지는 상대적으로 충분히 다루어지지 않았다. 이하에서는 이 세 가지 특징을 중심으로 가치사슬 내 공정 단계 간 기술융합(제2.2절), 기술융합의 동태적 전개(제2.3절), 특허 기반 기술융합 측정(제2.4절)을 차례로 검토한다.</w:t>
+        <w:t xml:space="preserve">이러한 선행연구는 세 가지 특징을 공유하며, 이는 본 연구의 출발점이 된다. 첫째, 연구의 초점이 서로 다른 산업이나 기술 분야 간의 중첩에 있다. 통신과 컴퓨팅, 식품과 제약, 나노기술과 바이오기술 등 대표적인 사례는 모두 서로 다른 산업의 기업들이 지식 기반의 중첩을 발견하는 경우에 해당한다(Gambardella and Torrisi, 1998; Bröring et al., 2006; No and Park, 2010). 둘째, 융합은 일반적으로 두 분야 사이의 공동분류나 인용을 집계한 분야 수준의 지표로 측정된다(Curran et al., 2010; Cho and Kim, 2014; Song et al., 2017; Choi et al., 2022). 이러한 지표는 두 분야가 융합하는지, 그리고 언제 융합하는지를 보여 주지만, 어떠한 발명이 융합을 포함하며 어떠한 특성을 지닌 발명이 그러한지는 설명하지 못한다. 개별 특허 간의 차이가 평균 속에 가려지기 때문이다. 셋째, 융합을 지식에서 기술과 응용을 거쳐 산업으로 나아가는 단계적 과정으로 보는 이론에 비해(Hacklin et al., 2010), 실증 연구는 대체로 융합의 정도가 증가하였는지를 추세로 확인하는 데 그쳤다. 즉, 융합이 진행되면서 어떠한 기술이 결합하며 융합의 내용과 중심이 어떻게 변화하는지는 상대적으로 충분히 다루어지지 않았다. 이하에서는 이 세 가지 특징을 중심으로 가치사슬 내 공정 단계 간 기술융합(제2.2절), 기술융합의 동태적 전개(제2.3절), 특허 기반 기술융합 측정(제2.4절)을 차례로 검토한다.</w:t>
       </w:r>
     </w:p>
     <w:bookmarkEnd w:id="11"/>
@@ -392,7 +392,7 @@
         <w:pStyle w:val="FirstParagraph"/>
       </w:pPr>
       <w:r>
-        <w:t xml:space="preserve">앞서 논의한 공정 단계 간 융합의 수준과 형태, 그리고 그 변화를 실증적으로 분석하기 위해서는 적절한 측정 방법이 필요하다. 융합 측정에 특허가 가장 널리 활용되는 이유는 분류 기호가 각 발명을 하나 이상의 기술 분야에 배치하기 때문이다(Curran and Leker, 2011). 기존 연구는 대체로 두 분야의 기호가 함께 부여된 특허의 수를 집계하여 분야 수준의 지수로 융합을 측정해 왔다(Cho and Kim, 2014; Jeong et al., 2015; Lee et al., 2015; Kwon et al., 2020). 한편 분류 체계가 발명을 사후적으로 반영한다는 한계를 보완하기 위해 특허 텍스트를 활용하는 연구도 이루어졌다(Preschitschek et al., 2013; Zhu and Motohashi, 2022).</w:t>
+        <w:t xml:space="preserve">앞서 논의한 공정 단계 간 융합의 수준과 형태, 그리고 그 변화를 실증적으로 분석하기 위해서는 적절한 측정 방법이 필요하다. 융합 측정에 특허가 가장 널리 활용되는 이유는 분류 기호가 각 발명을 하나 이상의 기술 분야에 배치하기 때문이다(Curran and Leker, 2011). 기존 연구는 대체로 두 분야의 기호가 함께 부여된 특허의 수를 집계하여 분야 수준의 지수로 융합을 측정해 왔다(Cho and Kim, 2014; Jeong et al., 2015; Lee et al., 2015; Yun and Geum, 2019; Kwon et al., 2020). 한편 분류 체계가 발명을 사후적으로 반영한다는 한계를 보완하기 위해 특허 텍스트를 활용하는 연구도 이루어졌다(Preschitschek et al., 2013; Zhu and Motohashi, 2022).</w:t>
       </w:r>
     </w:p>
     <w:p>
@@ -6072,7 +6072,7 @@
         <w:t xml:space="preserve"> </w:t>
       </w:r>
       <w:r>
-        <w:t xml:space="preserve">핵심 기술은 접합 기호이므로 공정 단독형 출원은 정의상 핵심 기술을 보유할 수 없다. 따라서 핵심 기술 모형은 H01L24 기호를 보유한 출원 763건(통합형 425건, 접합 단독형 338건)을 대상으로 통합형 여부를 종속변수로 하는 이항 로짓으로 분석한다. 이 모형은 접합 기호를 보유한 출원 가운데 어떠한 출원이 제조공정 기호도 함께 보유하는지를 분석하며, 부록 A의 대안 제외 민감도 분석과 동일한 표본을 사용한다. 모형은 log[P/(1 − P)] = β₀ + β₁·core + Σδ_t·period_t + Σθ_t·(core × period_t) + Σγ_k·ccode_k이다. 2014년 이전 출원에서 핵심 기술의 승산비는 exp(β₁)이고, 2015–2019년과 2020–2024년에는 exp(β₁ + θ_t)이며, exp(θ_t)는 각 시기의 승산비가 2014년 이전의 몇 배인지를 나타낸다. 핵심 기술을 포함한 출원의 통합형 우위가 최근으로 올수록 감소하였다면, 2014년 이전의 승산비는 1보다 크고 θ_t는 0보다 작게 나타날 것이다. 시기별 승산비의 95% 신뢰구간은 두 계수 합의 표준오차로 계산하며, 표준오차는 이분산에 강건한 방식으로 추정한다. 출원연도를 선형으로 투입하지 않고 세 시기로 구분한 것은 기술 순환의 단계를 근사하기 위함이다. 핵심 기호를 제외한 접합 기호 수를 통제한 결과는 제5.4절에 제시한다.</w:t>
+        <w:t xml:space="preserve">핵심 기술은 접합 기호이므로 공정 단독형 출원은 정의상 핵심 기술을 보유할 수 없다. 따라서 핵심 기술 모형은 H01L24 기호를 보유한 출원 763건(통합형 425건, 접합 단독형 338건)을 대상으로 통합형 여부를 종속변수로 하는 이항 로짓으로 분석한다. 이 모형은 접합 기호를 보유한 출원 가운데 어떠한 출원이 제조공정 기호도 함께 보유하는지를 분석하며, 부록 A의 대안 제외 민감도 분석과 동일한 표본을 사용한다. 모형은 log[P/(1 − P)] = β₀ + β₁·core + Σδ_t·period_t + Σθ_t·(core × period_t) + Σγ_k·ccode_k이다. 2014년 이전 출원에서 핵심 기술의 승산비는 exp(β₁)이고, 2015–2019년과 2020–2024년에는 exp(β₁ + θ_t)이며, exp(θ_t)는 각 시기의 승산비가 2014년 이전의 몇 배인지를 나타낸다. 핵심 기술을 포함한 출원의 통합형 우위가 최근으로 올수록 감소하였다면, 2014년 이전의 승산비는 1보다 크고 θ_t는 0보다 작게 나타날 것이다. 시기별 승산비의 95% 신뢰구간은 두 계수 합의 표준오차로 계산하며, 표준오차는 이분산에 강건한 방식으로 추정한다. 출원연도를 선형으로 투입하지 않고 세 시기로 구분한 것은 기술 순환의 단계를 근사하기 위함이다(Lee et al., 2017). 핵심 기호를 제외한 접합 기호 수를 통제한 결과는 제5.4절에 제시한다.</w:t>
       </w:r>
     </w:p>
     <w:p>
@@ -11881,7 +11881,7 @@
         <w:t xml:space="preserve"> </w:t>
       </w:r>
       <w:r>
-        <w:t xml:space="preserve">기존 문헌은 융합을 주로 산업과 산업, 기술 분야와 기술 분야 사이의 현상으로 다루어 왔다(Hacklin et al., 2010; Curran and Leker, 2011). 본 연구의 결과는 동일한 개념이 한 산업 내부의 경계, 즉 반도체 제조의 제조공정 영역과 접합 영역 사이에도 적용되며, 그 경계 넘기를 개별 특허에서 관찰할 수 있음을 보여 준다. 하이브리드 본딩 관련 특허의 45.8%는 두 영역의 기호를 함께 보유하며, 좁은 정의에서도 그 비중은 37.2%에 이른다. Jacobides et al.(2006)의 논의와 같이 산업 아키텍처가 분업의 틀이라면, 단계 간 인터페이스가 불안정해질 때 발명이 그 양쪽을 함께 포함하기 시작하는 것은 그 틀의 재편에 선행할 수 있는 기술적 상호의존의 확대이며, 본 연구는 이를 특허 공동분류로 포착하였다. Kapoor(2013)가 분업 속에서도 조직적 통합이 지속되었음을 보였다면, 본 연구는 그 통합의 기술적 기반, 즉 두 영역의 지식이 개별 발명 안에서 결합되고 있음을 보여 준다. 융합의 단계 논리(Hacklin et al., 2010)에 따르면 기술의 결합이 조직의 결합에 선행하므로, 경계를 넘는 특허의 분포가 조직 경계의 변화에 앞서 나타나는 지표가 될 수 있다는 가설은 후속 연구의 과제로 남긴다.</w:t>
+        <w:t xml:space="preserve">기존 문헌은 융합을 주로 산업과 산업, 기술 분야와 기술 분야 사이의 현상으로 다루어 왔다(Hacklin et al., 2010; Curran and Leker, 2011; Zhang and Zhang, 2025). 본 연구의 결과는 동일한 개념이 한 산업 내부의 경계, 즉 반도체 제조의 제조공정 영역과 접합 영역 사이에도 적용되며, 그 경계 넘기를 개별 특허에서 관찰할 수 있음을 보여 준다. 하이브리드 본딩 관련 특허의 45.8%는 두 영역의 기호를 함께 보유하며, 좁은 정의에서도 그 비중은 37.2%에 이른다. Jacobides et al.(2006)의 논의와 같이 산업 아키텍처가 분업의 틀이라면, 단계 간 인터페이스가 불안정해질 때 발명이 그 양쪽을 함께 포함하기 시작하는 것은 그 틀의 재편에 선행할 수 있는 기술적 상호의존의 확대이며, 본 연구는 이를 특허 공동분류로 포착하였다. Kapoor(2013)가 분업 속에서도 조직적 통합이 지속되었음을 보였다면, 본 연구는 그 통합의 기술적 기반, 즉 두 영역의 지식이 개별 발명 안에서 결합되고 있음을 보여 준다. 융합의 단계 논리(Hacklin et al., 2010)에 따르면 기술의 결합이 조직의 결합에 선행하므로, 경계를 넘는 특허의 분포가 조직 경계의 변화에 앞서 나타나는 지표가 될 수 있다는 가설은 후속 연구의 과제로 남긴다.</w:t>
       </w:r>
     </w:p>
     <w:p>
@@ -11889,7 +11889,7 @@
         <w:pStyle w:val="BodyText"/>
       </w:pPr>
       <w:r>
-        <w:t xml:space="preserve">이 결과는 또한 경계를 넘는 발명이 어떠한 특성을 지니는지에 대한 함의를 가진다. 본 연구에서 경계를 넘는 특허는 더 다양한 세부 기술을 포함하는 것으로 나타났다. Kodama(1992)의 융합은 기업의 연구개발 조직 수준에서, 융합 지수는 분야 수준에서 정의되었으나, 본 연구는 특허 수준의 증거를 통해 경계를 넘는 발명의 특징을 기술적 다양성에서 찾았으며, 이는 분야 수준의 지표로는 설명하기 어려웠던 ‘어떠한 발명이 융합을 포함하는가’라는 질문(제2.1절)에 대한 하나의 답이 된다. 더 많은 세부 기술에 걸치는 출원일수록 제조공정과 접합 기호를 함께 보유할 가능성이 높고, 범위가 좁은 출원은 한 영역에 머무는 경향이 있다. 이러한 연관은 형성기, 확산기, 재편기 모두에서 나타나, 융합의 중심이 이동하는 동안에도 유지되었다. 이는 특허 범위가 경제적 가치를 지닌다는 Lerner(1994)의 발견, 세분화된 기술 시장에서 넓은 포트폴리오가 유리하다는 Ziedonis(2004)의 설명과 맥을 같이한다. 성능과 수율이 인접한 공정 단계의 역량에 좌우되는 기술에서 넓은 기술적 다양성은 권리 보호 전략과도 관련될 수 있으며, 공정 단계 간 융합이 특허 분류에 드러나는 방식이기도 하다.</w:t>
+        <w:t xml:space="preserve">이 결과는 또한 경계를 넘는 발명이 어떠한 특성을 지니는지에 대한 함의를 가진다. 본 연구에서 경계를 넘는 특허는 더 다양한 세부 기술을 포함하는 것으로 나타났다. Kodama(1992)의 융합은 기업의 연구개발 조직 수준에서, 융합 지수는 분야 수준에서 정의되었으나, 본 연구는 특허 수준의 증거를 통해 경계를 넘는 발명의 특징을 기술적 다양성에서 찾았으며, 이는 분야 수준의 지표로는 설명하기 어려웠던 ‘어떠한 발명이 융합을 포함하는가’라는 질문(제2.1절)에 대한 하나의 답이 된다. 더 많은 세부 기술에 걸치는 출원일수록 제조공정과 접합 기호를 함께 보유할 가능성이 높고, 범위가 좁은 출원은 한 영역에 머무는 경향이 있다. 이러한 연관은 형성기, 확산기, 재편기 모두에서 나타나, 융합의 중심이 이동하는 동안에도 유지되었다. 이는 특허 범위가 경제적 가치를 지닌다는 Lerner(1994)의 발견, 세분화된 기술 시장에서 넓은 포트폴리오가 유리하다는 Ziedonis(2004)의 설명과 맥을 같이한다. 성능과 수율이 인접한 공정 단계의 역량에 좌우되는 기술에서 넓은 기술적 다양성은 권리 보호 전략과도 관련될 수 있으며(Zhao et al., 2023), 공정 단계 간 융합이 특허 분류에 드러나는 방식이기도 하다.</w:t>
       </w:r>
     </w:p>
     <w:p>
@@ -12659,7 +12659,7 @@
         <w:pStyle w:val="FirstParagraph"/>
       </w:pPr>
       <w:r>
-        <w:t xml:space="preserve">본 연구의 한계는 다음 여섯 가지로 정리할 수 있다. 첫째, 구성타당성의 문제이다. H01L21–H01L24 공동분류는 공정 단계 간 기술융합의 대리측정치이며, H01L21에는 패키징 단계의 제조공정도 포함되어 있고, 기술범위는 유형과 동일한 CPC 정보로부터 산출된다. 좁은 정의에서도 회귀 결과는 유지되었으나 통합형의 비중과 같은 기술통계는 정의에 따라 달라진다. 또한 CPC는 주기적으로 개정되고 과거 출원도 소급하여 재분류될 수 있으므로, 관찰된 시간적 변화의 일부는 기술 자체의 변화가 아니라 분류 체계와 심사 관행의 변화를 반영할 수 있다. 둘째, 표본 선택의 문제이다. 제목 키워드 검색은 기준이 명확하지만 제목에 관련어가 없는 출원을 포착하지 못하며, 검색어의 무관한 용법 68건은 별도로 판정하여 민감도 분석으로 확인해야 하였다. 셋째, 관측 단위와 중복의 문제이다. 분석 단위는 출원이며 공식 패밀리 식별자가 없어 동일 제목으로 근사 조정하였으므로, 관측치의 독립성이 완전히 보장되지는 않는다. 넷째, 누락변수의 문제이다. 출원인과 기업 유형, 국적, 응용처, 웨이퍼 단위와 다이 단위 접합의 구분이 자료에 포함되어 있지 않으며, 두 클래스 이외의 CPC 기호는 회귀 자료에 없다. 기술 클러스터와 기술 네트워크 표의 인덱싱 코드는 동일 출원의 전체 CPC 기호를 별도로 집계한 것이므로, 핵심 기술 변수는 회귀 자료에 포함된 접합 기호 네 개로만 정의하였다. 핵심 기술의 경계 역시 출원 200건 이상이라는 기준에 의존한다. 다만 가장 강한 쌍(24/08, 24/80)으로 한정하여도 결과는 동일하였다. 다섯째, 인과성의 문제이다. 다양성과 유형은 동시에 결정될 가능성이 높고 적절한 도구변수가 없으므로 인과관계는 주장하지 않으며, 출원청은 통제변수로만 포함하였다. 핵심 기술 분석의 시기 구분 역시 지배적 설계의 형성 시점을 직접 측정한 것이 아니라 출원 시기로 근사한 것이다. 여섯째, 측정 시점의 문제이다. 융합의 신호로 사용한 CPC 공동분류는 재현 가능하지만 발명보다 늦게 부여된다. 텍스트 기반 방법(Preschitschek et al., 2013; Zhu and Motohashi, 2022)은 보다 이른 탐지가 가능하지만 학습된 모형에 의존한다. H01L21과 H01L24의 경계가 제도적으로 명확한 본 연구에서는 재현성을 우선하였다.</w:t>
+        <w:t xml:space="preserve">본 연구의 한계는 다음 여섯 가지로 정리할 수 있다. 첫째, 구성타당성의 문제이다. H01L21–H01L24 공동분류는 공정 단계 간 기술융합의 대리측정치이며, H01L21에는 패키징 단계의 제조공정도 포함되어 있고, 기술범위는 유형과 동일한 CPC 정보로부터 산출된다. 좁은 정의에서도 회귀 결과는 유지되었으나 통합형의 비중과 같은 기술통계는 정의에 따라 달라진다. 또한 CPC는 주기적으로 개정되고 과거 출원도 소급하여 재분류될 수 있으므로, 관찰된 시간적 변화의 일부는 기술 자체의 변화가 아니라 분류 체계와 심사 관행의 변화를 반영할 수 있다. 둘째, 표본 선택의 문제이다. 제목 키워드 검색은 기준이 명확하지만 제목에 관련어가 없는 출원을 포착하지 못하며, 검색어의 무관한 용법 68건은 별도로 판정하여 민감도 분석으로 확인해야 하였다. 셋째, 관측 단위와 중복의 문제이다. 분석 단위는 출원이며 공식 패밀리 식별자가 없어 동일 제목으로 근사 조정하였으므로, 관측치의 독립성이 완전히 보장되지는 않는다. 넷째, 누락변수의 문제이다. 출원인과 기업 유형, 국적, 응용처, 웨이퍼 단위와 다이 단위 접합의 구분이 자료에 포함되어 있지 않으며, 두 클래스 이외의 CPC 기호는 회귀 자료에 없다. 기술 클러스터와 기술 네트워크 표의 인덱싱 코드는 동일 출원의 전체 CPC 기호를 별도로 집계한 것이므로, 핵심 기술 변수는 회귀 자료에 포함된 접합 기호 네 개로만 정의하였다. 핵심 기술의 경계 역시 출원 200건 이상이라는 기준에 의존한다. 다만 가장 강한 쌍(24/08, 24/80)으로 한정하여도 결과는 동일하였다. 다섯째, 인과성의 문제이다. 다양성과 유형은 동시에 결정될 가능성이 높고 적절한 도구변수가 없으므로 인과관계는 주장하지 않으며, 출원청은 통제변수로만 포함하였다. 핵심 기술 분석의 시기 구분 역시 지배적 설계의 형성 시점을 직접 측정한 것이 아니라 출원 시기로 근사한 것이다. 여섯째, 측정 시점의 문제이다. 융합의 신호로 사용한 CPC 공동분류는 재현 가능하지만 발명보다 늦게 부여된다. 텍스트 기반 방법(Preschitschek et al., 2013; Lei et al., 2019; Zhu and Motohashi, 2022)은 보다 이른 탐지가 가능하지만 학습된 모형에 의존한다. H01L21과 H01L24의 경계가 제도적으로 명확한 본 연구에서는 재현성을 우선하였다.</w:t>
       </w:r>
     </w:p>
     <w:p>
@@ -12835,6 +12835,14 @@
         <w:pStyle w:val="BodyText"/>
       </w:pPr>
       <w:r>
+        <w:t xml:space="preserve">Choi, S., Afifuddin, M., Seo, W., 2022. A supervised learning-based approach to anticipating potential technology convergence. IEEE Access 10, 19284–19300. https://doi.org/10.1109/ACCESS.2022.3151870</w:t>
+      </w:r>
+    </w:p>
+    <w:p>
+      <w:pPr>
+        <w:pStyle w:val="BodyText"/>
+      </w:pPr>
+      <w:r>
         <w:t xml:space="preserve">Curran, C.-S., Bröring, S., Leker, J., 2010. Anticipating converging industries using publicly available data. Technological Forecasting and Social Change 77 (3), 385–395. https://doi.org/10.1016/j.techfore.2009.10.002</w:t>
       </w:r>
     </w:p>
@@ -13035,6 +13043,14 @@
         <w:pStyle w:val="BodyText"/>
       </w:pPr>
       <w:r>
+        <w:t xml:space="preserve">Lee, C., Kim, J., Noh, M., Woo, H., Gang, K., 2017. Patterns of technology life cycles: Stochastic analysis based on patent citations. Technology Analysis &amp; Strategic Management 29 (1), 53–67. https://doi.org/10.1080/09537325.2016.1194974</w:t>
+      </w:r>
+    </w:p>
+    <w:p>
+      <w:pPr>
+        <w:pStyle w:val="BodyText"/>
+      </w:pPr>
+      <w:r>
         <w:t xml:space="preserve">Lee, W.S., Han, E.J., Sohn, S.Y., 2015. Predicting the pattern of technology convergence using big-data technology on large-scale triadic patents. Technological Forecasting and Social Change 100, 317–329. https://doi.org/10.1016/j.techfore.2015.07.022</w:t>
       </w:r>
     </w:p>
@@ -13043,6 +13059,14 @@
         <w:pStyle w:val="BodyText"/>
       </w:pPr>
       <w:r>
+        <w:t xml:space="preserve">Lei, L., Qi, J., Zheng, K., 2019. Patent analytics based on feature vector space model: A case of IoT. IEEE Access 7, 45705–45715. https://doi.org/10.1109/ACCESS.2019.2909123</w:t>
+      </w:r>
+    </w:p>
+    <w:p>
+      <w:pPr>
+        <w:pStyle w:val="BodyText"/>
+      </w:pPr>
+      <w:r>
         <w:t xml:space="preserve">Lerner, J., 1994. The importance of patent scope: An empirical analysis. RAND Journal of Economics 25 (2), 319–333. https://doi.org/10.2307/2555833</w:t>
       </w:r>
     </w:p>
@@ -13124,6 +13148,38 @@
       </w:pPr>
       <w:r>
         <w:t xml:space="preserve">Sternitzke, C., Bartkowski, A., Schramm, R., 2008. Visualizing patent statistics by means of social network analysis tools. World Patent Information 30 (2), 115–131. https://doi.org/10.1016/j.wpi.2007.08.003</w:t>
+      </w:r>
+    </w:p>
+    <w:p>
+      <w:pPr>
+        <w:pStyle w:val="BodyText"/>
+      </w:pPr>
+      <w:r>
+        <w:t xml:space="preserve">Whang, Y.-K., 2018. Convergence processes in the mobile communication processor. Technology Analysis &amp; Strategic Management 30 (11), 1338–1350. https://doi.org/10.1080/09537325.2018.1461206</w:t>
+      </w:r>
+    </w:p>
+    <w:p>
+      <w:pPr>
+        <w:pStyle w:val="BodyText"/>
+      </w:pPr>
+      <w:r>
+        <w:t xml:space="preserve">Yun, J., Geum, Y., 2019. Analysing the dynamics of technological convergence using a co-classification approach: A case of healthcare services. Technology Analysis &amp; Strategic Management 31 (12), 1412–1429. https://doi.org/10.1080/09537325.2019.1616082</w:t>
+      </w:r>
+    </w:p>
+    <w:p>
+      <w:pPr>
+        <w:pStyle w:val="BodyText"/>
+      </w:pPr>
+      <w:r>
+        <w:t xml:space="preserve">Zhang, Z., Zhang, Q., 2025. Bridging the digital and green divide: Technology convergence and productivity in innovative manufacturing. Journal of Innovation &amp; Knowledge 10 (6), 100848. https://doi.org/10.1016/j.jik.2025.100848</w:t>
+      </w:r>
+    </w:p>
+    <w:p>
+      <w:pPr>
+        <w:pStyle w:val="BodyText"/>
+      </w:pPr>
+      <w:r>
+        <w:t xml:space="preserve">Zhao, X., Guo, Y., Mi, J., 2023. Value creation and value capture from patents: Theory and implications for patent strategies. Journal of Innovation &amp; Knowledge 8 (3), 100397. https://doi.org/10.1016/j.jik.2023.100397</w:t>
       </w:r>
     </w:p>
     <w:p>

</xml_diff>